<commit_message>
some changes on word document
</commit_message>
<xml_diff>
--- a/spaceShooter/Fuzzy system report.docx
+++ b/spaceShooter/Fuzzy system report.docx
@@ -310,35 +310,25 @@
                                 <w:spacing w:before="120"/>
                                 <w:jc w:val="center"/>
                                 <w:rPr>
-                                  <w:rFonts w:asciiTheme="majorHAnsi" w:hAnsiTheme="majorHAnsi" w:cstheme="majorHAnsi"/>
+                                  <w:rFonts w:asciiTheme="majorHAnsi" w:hAnsiTheme="majorHAnsi" w:hint="cs"/>
                                   <w:color w:val="FFFFFF" w:themeColor="background1"/>
                                   <w:sz w:val="28"/>
                                   <w:szCs w:val="28"/>
                                   <w:rtl/>
+                                  <w:lang w:bidi="ar-SY"/>
                                 </w:rPr>
                               </w:pPr>
                               <w:r>
                                 <w:rPr>
-                                  <w:rFonts w:asciiTheme="majorHAnsi" w:hAnsiTheme="majorHAnsi" w:cstheme="majorHAnsi"/>
+                                  <w:rFonts w:asciiTheme="majorHAnsi" w:hAnsiTheme="majorHAnsi" w:hint="cs"/>
                                   <w:color w:val="FFFFFF" w:themeColor="background1"/>
                                   <w:sz w:val="28"/>
                                   <w:szCs w:val="28"/>
                                   <w:rtl/>
+                                  <w:lang w:bidi="ar-SY"/>
                                 </w:rPr>
-                                <w:t xml:space="preserve">محمد خير محمد غسان </w:t>
+                                <w:t>محمد غسان محمد خير الخاني</w:t>
                               </w:r>
-                              <w:proofErr w:type="spellStart"/>
-                              <w:r>
-                                <w:rPr>
-                                  <w:rFonts w:asciiTheme="majorHAnsi" w:hAnsiTheme="majorHAnsi" w:cstheme="majorHAnsi"/>
-                                  <w:color w:val="FFFFFF" w:themeColor="background1"/>
-                                  <w:sz w:val="28"/>
-                                  <w:szCs w:val="28"/>
-                                  <w:rtl/>
-                                </w:rPr>
-                                <w:t>الخاني</w:t>
-                              </w:r>
-                              <w:proofErr w:type="spellEnd"/>
                             </w:p>
                             <w:p>
                               <w:pPr>
@@ -412,29 +402,7 @@
                                   <w:szCs w:val="28"/>
                                   <w:rtl/>
                                 </w:rPr>
-                                <w:t xml:space="preserve">محمد </w:t>
-                              </w:r>
-                              <w:proofErr w:type="spellStart"/>
-                              <w:r>
-                                <w:rPr>
-                                  <w:rFonts w:asciiTheme="majorHAnsi" w:hAnsiTheme="majorHAnsi" w:cstheme="majorHAnsi"/>
-                                  <w:color w:val="FFFFFF" w:themeColor="background1"/>
-                                  <w:sz w:val="28"/>
-                                  <w:szCs w:val="28"/>
-                                  <w:rtl/>
-                                </w:rPr>
-                                <w:t>محمد</w:t>
-                              </w:r>
-                              <w:proofErr w:type="spellEnd"/>
-                              <w:r>
-                                <w:rPr>
-                                  <w:rFonts w:asciiTheme="majorHAnsi" w:hAnsiTheme="majorHAnsi" w:cstheme="majorHAnsi"/>
-                                  <w:color w:val="FFFFFF" w:themeColor="background1"/>
-                                  <w:sz w:val="28"/>
-                                  <w:szCs w:val="28"/>
-                                  <w:rtl/>
-                                </w:rPr>
-                                <w:t xml:space="preserve"> زياد المجذوب</w:t>
+                                <w:t>محمد محمد زياد المجذوب</w:t>
                               </w:r>
                             </w:p>
                             <w:p>
@@ -611,35 +579,25 @@
                           <w:spacing w:before="120"/>
                           <w:jc w:val="center"/>
                           <w:rPr>
-                            <w:rFonts w:asciiTheme="majorHAnsi" w:hAnsiTheme="majorHAnsi" w:cstheme="majorHAnsi"/>
+                            <w:rFonts w:asciiTheme="majorHAnsi" w:hAnsiTheme="majorHAnsi" w:hint="cs"/>
                             <w:color w:val="FFFFFF" w:themeColor="background1"/>
                             <w:sz w:val="28"/>
                             <w:szCs w:val="28"/>
                             <w:rtl/>
+                            <w:lang w:bidi="ar-SY"/>
                           </w:rPr>
                         </w:pPr>
                         <w:r>
                           <w:rPr>
-                            <w:rFonts w:asciiTheme="majorHAnsi" w:hAnsiTheme="majorHAnsi" w:cstheme="majorHAnsi"/>
+                            <w:rFonts w:asciiTheme="majorHAnsi" w:hAnsiTheme="majorHAnsi" w:hint="cs"/>
                             <w:color w:val="FFFFFF" w:themeColor="background1"/>
                             <w:sz w:val="28"/>
                             <w:szCs w:val="28"/>
                             <w:rtl/>
+                            <w:lang w:bidi="ar-SY"/>
                           </w:rPr>
-                          <w:t xml:space="preserve">محمد خير محمد غسان </w:t>
+                          <w:t>محمد غسان محمد خير الخاني</w:t>
                         </w:r>
-                        <w:proofErr w:type="spellStart"/>
-                        <w:r>
-                          <w:rPr>
-                            <w:rFonts w:asciiTheme="majorHAnsi" w:hAnsiTheme="majorHAnsi" w:cstheme="majorHAnsi"/>
-                            <w:color w:val="FFFFFF" w:themeColor="background1"/>
-                            <w:sz w:val="28"/>
-                            <w:szCs w:val="28"/>
-                            <w:rtl/>
-                          </w:rPr>
-                          <w:t>الخاني</w:t>
-                        </w:r>
-                        <w:proofErr w:type="spellEnd"/>
                       </w:p>
                       <w:p>
                         <w:pPr>
@@ -713,29 +671,7 @@
                             <w:szCs w:val="28"/>
                             <w:rtl/>
                           </w:rPr>
-                          <w:t xml:space="preserve">محمد </w:t>
-                        </w:r>
-                        <w:proofErr w:type="spellStart"/>
-                        <w:r>
-                          <w:rPr>
-                            <w:rFonts w:asciiTheme="majorHAnsi" w:hAnsiTheme="majorHAnsi" w:cstheme="majorHAnsi"/>
-                            <w:color w:val="FFFFFF" w:themeColor="background1"/>
-                            <w:sz w:val="28"/>
-                            <w:szCs w:val="28"/>
-                            <w:rtl/>
-                          </w:rPr>
-                          <w:t>محمد</w:t>
-                        </w:r>
-                        <w:proofErr w:type="spellEnd"/>
-                        <w:r>
-                          <w:rPr>
-                            <w:rFonts w:asciiTheme="majorHAnsi" w:hAnsiTheme="majorHAnsi" w:cstheme="majorHAnsi"/>
-                            <w:color w:val="FFFFFF" w:themeColor="background1"/>
-                            <w:sz w:val="28"/>
-                            <w:szCs w:val="28"/>
-                            <w:rtl/>
-                          </w:rPr>
-                          <w:t xml:space="preserve"> زياد المجذوب</w:t>
+                          <w:t>محمد محمد زياد المجذوب</w:t>
                         </w:r>
                       </w:p>
                       <w:p>
@@ -845,7 +781,7 @@
           <w:noProof/>
         </w:rPr>
         <w:drawing>
-          <wp:anchor distT="0" distB="0" distL="114300" distR="114300" simplePos="0" relativeHeight="251672576" behindDoc="0" locked="0" layoutInCell="1" allowOverlap="1" wp14:anchorId="560F7A70" wp14:editId="24C5AED4">
+          <wp:anchor distT="0" distB="0" distL="114300" distR="114300" simplePos="0" relativeHeight="251672576" behindDoc="0" locked="0" layoutInCell="1" allowOverlap="1" wp14:anchorId="560F7A70" wp14:editId="435B90A2">
             <wp:simplePos x="0" y="0"/>
             <wp:positionH relativeFrom="column">
               <wp:posOffset>3138170</wp:posOffset>
@@ -924,7 +860,7 @@
           <w:noProof/>
         </w:rPr>
         <w:drawing>
-          <wp:anchor distT="0" distB="0" distL="114300" distR="114300" simplePos="0" relativeHeight="251678720" behindDoc="0" locked="0" layoutInCell="1" allowOverlap="1" wp14:anchorId="41747325" wp14:editId="3CA0A631">
+          <wp:anchor distT="0" distB="0" distL="114300" distR="114300" simplePos="0" relativeHeight="251678720" behindDoc="0" locked="0" layoutInCell="1" allowOverlap="1" wp14:anchorId="41747325" wp14:editId="04CCE436">
             <wp:simplePos x="0" y="0"/>
             <wp:positionH relativeFrom="margin">
               <wp:align>center</wp:align>
@@ -1003,7 +939,7 @@
           <w:noProof/>
         </w:rPr>
         <w:drawing>
-          <wp:anchor distT="0" distB="0" distL="114300" distR="114300" simplePos="0" relativeHeight="251676672" behindDoc="0" locked="0" layoutInCell="1" allowOverlap="1" wp14:anchorId="7E3A3B20" wp14:editId="5CB3431A">
+          <wp:anchor distT="0" distB="0" distL="114300" distR="114300" simplePos="0" relativeHeight="251676672" behindDoc="0" locked="0" layoutInCell="1" allowOverlap="1" wp14:anchorId="7E3A3B20" wp14:editId="0A98038D">
             <wp:simplePos x="0" y="0"/>
             <wp:positionH relativeFrom="column">
               <wp:posOffset>3771265</wp:posOffset>
@@ -1082,7 +1018,7 @@
           <w:noProof/>
         </w:rPr>
         <w:drawing>
-          <wp:anchor distT="0" distB="0" distL="114300" distR="114300" simplePos="0" relativeHeight="251664384" behindDoc="0" locked="0" layoutInCell="1" allowOverlap="1" wp14:anchorId="49466607" wp14:editId="5D7F508E">
+          <wp:anchor distT="0" distB="0" distL="114300" distR="114300" simplePos="0" relativeHeight="251664384" behindDoc="0" locked="0" layoutInCell="1" allowOverlap="1" wp14:anchorId="49466607" wp14:editId="76BEA39F">
             <wp:simplePos x="0" y="0"/>
             <wp:positionH relativeFrom="margin">
               <wp:align>center</wp:align>
@@ -1157,7 +1093,7 @@
           <w:noProof/>
         </w:rPr>
         <w:drawing>
-          <wp:anchor distT="0" distB="0" distL="114300" distR="114300" simplePos="0" relativeHeight="251674624" behindDoc="0" locked="0" layoutInCell="1" allowOverlap="1" wp14:anchorId="69B2DF4B" wp14:editId="3E7238E7">
+          <wp:anchor distT="0" distB="0" distL="114300" distR="114300" simplePos="0" relativeHeight="251674624" behindDoc="0" locked="0" layoutInCell="1" allowOverlap="1" wp14:anchorId="69B2DF4B" wp14:editId="20A50BB3">
             <wp:simplePos x="0" y="0"/>
             <wp:positionH relativeFrom="column">
               <wp:posOffset>1476375</wp:posOffset>
@@ -1235,7 +1171,7 @@
           <w:noProof/>
         </w:rPr>
         <w:drawing>
-          <wp:anchor distT="0" distB="0" distL="114300" distR="114300" simplePos="0" relativeHeight="251670528" behindDoc="0" locked="0" layoutInCell="1" allowOverlap="1" wp14:anchorId="7EA36202" wp14:editId="6E644374">
+          <wp:anchor distT="0" distB="0" distL="114300" distR="114300" simplePos="0" relativeHeight="251670528" behindDoc="0" locked="0" layoutInCell="1" allowOverlap="1" wp14:anchorId="7EA36202" wp14:editId="40E4B29D">
             <wp:simplePos x="0" y="0"/>
             <wp:positionH relativeFrom="margin">
               <wp:posOffset>1676400</wp:posOffset>
@@ -1391,7 +1327,7 @@
           <w:noProof/>
         </w:rPr>
         <w:drawing>
-          <wp:anchor distT="0" distB="0" distL="114300" distR="114300" simplePos="0" relativeHeight="251668480" behindDoc="0" locked="0" layoutInCell="1" allowOverlap="1" wp14:anchorId="0CDCB14A" wp14:editId="2BC87F2A">
+          <wp:anchor distT="0" distB="0" distL="114300" distR="114300" simplePos="0" relativeHeight="251668480" behindDoc="0" locked="0" layoutInCell="1" allowOverlap="1" wp14:anchorId="0CDCB14A" wp14:editId="41645383">
             <wp:simplePos x="0" y="0"/>
             <wp:positionH relativeFrom="margin">
               <wp:posOffset>2228850</wp:posOffset>
@@ -1466,7 +1402,7 @@
           <w:noProof/>
         </w:rPr>
         <w:drawing>
-          <wp:anchor distT="0" distB="0" distL="114300" distR="114300" simplePos="0" relativeHeight="251666432" behindDoc="0" locked="0" layoutInCell="1" allowOverlap="1" wp14:anchorId="1DE30C5F" wp14:editId="480D506D">
+          <wp:anchor distT="0" distB="0" distL="114300" distR="114300" simplePos="0" relativeHeight="251666432" behindDoc="0" locked="0" layoutInCell="1" allowOverlap="1" wp14:anchorId="1DE30C5F" wp14:editId="0E2BCD01">
             <wp:simplePos x="0" y="0"/>
             <wp:positionH relativeFrom="margin">
               <wp:posOffset>3238500</wp:posOffset>
@@ -1745,15 +1681,7 @@
         <w:jc w:val="both"/>
       </w:pPr>
       <w:r>
-        <w:t>The core game environment was adapted from an open-source framework (</w:t>
-      </w:r>
-      <w:proofErr w:type="spellStart"/>
-      <w:r>
-        <w:t>SpaceShooter</w:t>
-      </w:r>
-      <w:proofErr w:type="spellEnd"/>
-      <w:r>
-        <w:t xml:space="preserve"> by Tasdik Rahman), which originally featured static enemy generation. The primary contribution of this project is the complete replacement of that static logic with an intelligent, real-time DDA engine. By utilizing fuzzy logic, the system continuously monitors the player's performance and seamlessly alters the game environment in real-time, mapping complex, uncertain human skill levels into precise mathematical outputs.</w:t>
+        <w:t>The core game environment was adapted from an open-source framework (SpaceShooter by Tasdik Rahman), which originally featured static enemy generation. The primary contribution of this project is the complete replacement of that static logic with an intelligent, real-time DDA engine. By utilizing fuzzy logic, the system continuously monitors the player's performance and seamlessly alters the game environment in real-time, mapping complex, uncertain human skill levels into precise mathematical outputs.</w:t>
       </w:r>
     </w:p>
     <w:p>
@@ -1810,15 +1738,7 @@
         <w:jc w:val="both"/>
       </w:pPr>
       <w:r>
-        <w:t xml:space="preserve">Traditional DDA systems often rely on hard-coded thresholds (e.g., IF kills &gt; 50 THEN difficulty = hard), which can lead to jarring, unnatural spikes in gameplay. By solving this problem using a Fuzzy Expert System via the Mamdani inference method, the game achieves smooth, overlapping transitions. The system evaluates multiple performance metrics simultaneously, calculating a weighted, </w:t>
-      </w:r>
-      <w:proofErr w:type="spellStart"/>
-      <w:r>
-        <w:t>defuzzified</w:t>
-      </w:r>
-      <w:proofErr w:type="spellEnd"/>
-      <w:r>
-        <w:t xml:space="preserve"> response that feels organic and invisible to the player.</w:t>
+        <w:t>Traditional DDA systems often rely on hard-coded thresholds (e.g., IF kills &gt; 50 THEN difficulty = hard), which can lead to jarring, unnatural spikes in gameplay. By solving this problem using a Fuzzy Expert System via the Mamdani inference method, the game achieves smooth, overlapping transitions. The system evaluates multiple performance metrics simultaneously, calculating a weighted, defuzzified response that feels organic and invisible to the player.</w:t>
       </w:r>
     </w:p>
     <w:p>
@@ -1870,23 +1790,7 @@
           <w:b/>
           <w:bCs/>
         </w:rPr>
-        <w:t>Mobs Killed (</w:t>
-      </w:r>
-      <w:proofErr w:type="spellStart"/>
-      <w:r>
-        <w:rPr>
-          <w:b/>
-          <w:bCs/>
-        </w:rPr>
-        <w:t>mobs_killed</w:t>
-      </w:r>
-      <w:proofErr w:type="spellEnd"/>
-      <w:r>
-        <w:rPr>
-          <w:b/>
-          <w:bCs/>
-        </w:rPr>
-        <w:t xml:space="preserve"> | 0 - 600):</w:t>
+        <w:t>Mobs Killed (mobs_killed | 0 - 600):</w:t>
       </w:r>
       <w:r>
         <w:t xml:space="preserve"> The total number of enemies destroyed. Acts as the primary indicator of the player's offensive capability and skill.</w:t>
@@ -1905,23 +1809,7 @@
           <w:b/>
           <w:bCs/>
         </w:rPr>
-        <w:t>Time Elapsed (</w:t>
-      </w:r>
-      <w:proofErr w:type="spellStart"/>
-      <w:r>
-        <w:rPr>
-          <w:b/>
-          <w:bCs/>
-        </w:rPr>
-        <w:t>time_elapsed</w:t>
-      </w:r>
-      <w:proofErr w:type="spellEnd"/>
-      <w:r>
-        <w:rPr>
-          <w:b/>
-          <w:bCs/>
-        </w:rPr>
-        <w:t xml:space="preserve"> | 0 - 600 seconds):</w:t>
+        <w:t>Time Elapsed (time_elapsed | 0 - 600 seconds):</w:t>
       </w:r>
       <w:r>
         <w:t xml:space="preserve"> The duration of the current survival run. Indicates endurance and familiarity with the game mechanics.</w:t>
@@ -1979,23 +1867,7 @@
           <w:b/>
           <w:bCs/>
         </w:rPr>
-        <w:t>Gun Level (</w:t>
-      </w:r>
-      <w:proofErr w:type="spellStart"/>
-      <w:r>
-        <w:rPr>
-          <w:b/>
-          <w:bCs/>
-        </w:rPr>
-        <w:t>gun_level</w:t>
-      </w:r>
-      <w:proofErr w:type="spellEnd"/>
-      <w:r>
-        <w:rPr>
-          <w:b/>
-          <w:bCs/>
-        </w:rPr>
-        <w:t xml:space="preserve"> | 1 - 3):</w:t>
+        <w:t>Gun Level (gun_level | 1 - 3):</w:t>
       </w:r>
       <w:r>
         <w:t xml:space="preserve"> The current firepower state. High firepower requires tougher enemies to maintain balance.</w:t>
@@ -2014,23 +1886,7 @@
           <w:b/>
           <w:bCs/>
         </w:rPr>
-        <w:t>Restart Count (</w:t>
-      </w:r>
-      <w:proofErr w:type="spellStart"/>
-      <w:r>
-        <w:rPr>
-          <w:b/>
-          <w:bCs/>
-        </w:rPr>
-        <w:t>restart_count</w:t>
-      </w:r>
-      <w:proofErr w:type="spellEnd"/>
-      <w:r>
-        <w:rPr>
-          <w:b/>
-          <w:bCs/>
-        </w:rPr>
-        <w:t xml:space="preserve"> | 0 - 20):</w:t>
+        <w:t>Restart Count (restart_count | 0 - 20):</w:t>
       </w:r>
       <w:r>
         <w:t xml:space="preserve"> A historical metric tracking how many times the player has died and restarted the session. High restarts indicate persistent struggle, triggering baseline difficulty reductions.</w:t>
@@ -2061,23 +1917,7 @@
           <w:b/>
           <w:bCs/>
         </w:rPr>
-        <w:t>Speed Multiplier (</w:t>
-      </w:r>
-      <w:proofErr w:type="spellStart"/>
-      <w:r>
-        <w:rPr>
-          <w:b/>
-          <w:bCs/>
-        </w:rPr>
-        <w:t>speed_mult</w:t>
-      </w:r>
-      <w:proofErr w:type="spellEnd"/>
-      <w:r>
-        <w:rPr>
-          <w:b/>
-          <w:bCs/>
-        </w:rPr>
-        <w:t xml:space="preserve"> | 0.5x - 1.55x):</w:t>
+        <w:t>Speed Multiplier (speed_mult | 0.5x - 1.5x):</w:t>
       </w:r>
       <w:r>
         <w:t xml:space="preserve"> Alters the velocity of enemy projectiles and movements.</w:t>
@@ -2096,23 +1936,23 @@
           <w:b/>
           <w:bCs/>
         </w:rPr>
-        <w:t>Spawn Delay (</w:t>
-      </w:r>
-      <w:proofErr w:type="spellStart"/>
-      <w:r>
-        <w:rPr>
+        <w:t>Spawn Delay (spawn_delay | 0.5s - 3.</w:t>
+      </w:r>
+      <w:r>
+        <w:rPr>
+          <w:rFonts w:hint="cs"/>
           <w:b/>
           <w:bCs/>
-        </w:rPr>
-        <w:t>spawn_delay</w:t>
-      </w:r>
-      <w:proofErr w:type="spellEnd"/>
+          <w:rtl/>
+        </w:rPr>
+        <w:t>0</w:t>
+      </w:r>
       <w:r>
         <w:rPr>
           <w:b/>
           <w:bCs/>
         </w:rPr>
-        <w:t xml:space="preserve"> | 0.5s - 3.1s):</w:t>
+        <w:t>s):</w:t>
       </w:r>
       <w:r>
         <w:t xml:space="preserve"> Controls the frequency of enemy generation. A lower delay increases the density of the swarm.</w:t>
@@ -2131,23 +1971,7 @@
           <w:b/>
           <w:bCs/>
         </w:rPr>
-        <w:t>Mob Size (</w:t>
-      </w:r>
-      <w:proofErr w:type="spellStart"/>
-      <w:r>
-        <w:rPr>
-          <w:b/>
-          <w:bCs/>
-        </w:rPr>
-        <w:t>mob_size</w:t>
-      </w:r>
-      <w:proofErr w:type="spellEnd"/>
-      <w:r>
-        <w:rPr>
-          <w:b/>
-          <w:bCs/>
-        </w:rPr>
-        <w:t xml:space="preserve"> | 0.6x - 1.85x):</w:t>
+        <w:t>Mob Size (mob_size | 0.6x - 1.8x):</w:t>
       </w:r>
       <w:r>
         <w:t xml:space="preserve"> Scales the physical hitbox of the enemies. Larger enemies are easier to hit but take up more screen space, forcing defensive maneuvering.</w:t>
@@ -2190,23 +2014,7 @@
           <w:b/>
           <w:bCs/>
         </w:rPr>
-        <w:t>Gaussian Curves for Gradual Impact (</w:t>
-      </w:r>
-      <w:proofErr w:type="spellStart"/>
-      <w:r>
-        <w:rPr>
-          <w:b/>
-          <w:bCs/>
-        </w:rPr>
-        <w:t>mobs_killed</w:t>
-      </w:r>
-      <w:proofErr w:type="spellEnd"/>
-      <w:r>
-        <w:rPr>
-          <w:b/>
-          <w:bCs/>
-        </w:rPr>
-        <w:t>):</w:t>
+        <w:t>Gaussian Curves for Gradual Impact (mobs_killed):</w:t>
       </w:r>
       <w:r>
         <w:t xml:space="preserve"> Player kill counts scale non-linearly and represent a fluid progression of skill. Gaussian (bell-shaped) curves were chosen for this input because incremental changes in this value have a minimal immediate impact on the player's overarching skill state. The Gaussian curve prevents minor numerical fluctuations from causing abrupt, jarring shifts in difficulty, providing a smooth, continuous gradient that naturally models the subjective transition from a "beginner" to an "expert" player.</w:t>
@@ -2225,17 +2033,15 @@
           <w:b/>
           <w:bCs/>
         </w:rPr>
-        <w:t xml:space="preserve">Triangular Functions for High Sensitivity (health, </w:t>
-      </w:r>
-      <w:proofErr w:type="spellStart"/>
+        <w:t>Triangular Functions for High Sensitivity (</w:t>
+      </w:r>
       <w:r>
         <w:rPr>
           <w:b/>
           <w:bCs/>
         </w:rPr>
-        <w:t>gun_level</w:t>
-      </w:r>
-      <w:proofErr w:type="spellEnd"/>
+        <w:t>Lives</w:t>
+      </w:r>
       <w:r>
         <w:rPr>
           <w:b/>
@@ -2243,32 +2049,50 @@
         </w:rPr>
         <w:t xml:space="preserve">, </w:t>
       </w:r>
-      <w:proofErr w:type="spellStart"/>
       <w:r>
         <w:rPr>
           <w:b/>
           <w:bCs/>
         </w:rPr>
-        <w:t>speed_mult</w:t>
-      </w:r>
-      <w:proofErr w:type="spellEnd"/>
+        <w:t>health, gun_level, speed_mult</w:t>
+      </w:r>
       <w:r>
         <w:rPr>
           <w:b/>
           <w:bCs/>
         </w:rPr>
+        <w:t xml:space="preserve">, </w:t>
+      </w:r>
+      <w:r>
+        <w:rPr>
+          <w:b/>
+          <w:bCs/>
+        </w:rPr>
+        <w:t>spawn_delay</w:t>
+      </w:r>
+      <w:r>
+        <w:rPr>
+          <w:b/>
+          <w:bCs/>
+        </w:rPr>
+        <w:t xml:space="preserve">, </w:t>
+      </w:r>
+      <w:r>
+        <w:rPr>
+          <w:b/>
+          <w:bCs/>
+        </w:rPr>
+        <w:t>mob_size</w:t>
+      </w:r>
+      <w:r>
+        <w:rPr>
+          <w:b/>
+          <w:bCs/>
+        </w:rPr>
         <w:t>):</w:t>
       </w:r>
       <w:r>
-        <w:t xml:space="preserve"> Conversely, Triangular functions (</w:t>
-      </w:r>
-      <w:proofErr w:type="spellStart"/>
-      <w:r>
-        <w:t>trimf</w:t>
-      </w:r>
-      <w:proofErr w:type="spellEnd"/>
-      <w:r>
-        <w:t>) were deployed for metrics where every small change is highly impactful and requires a more discrete, immediate logical response. For instance, a drop in health or lives signifies a critical shift in player survivability. The sharp peaks and strict linear slopes of a triangular function ensure the system reacts sensitively and decisively to these crucial thresholds, as there is a definitive, undeniable peak to what constitutes "50% Health" or "Gun Level 2."</w:t>
+        <w:t xml:space="preserve"> Conversely, Triangular functions (trimf) were deployed for metrics where every small change is highly impactful and requires a more discrete, immediate logical response. For instance, a drop in health or lives signifies a critical shift in player survivability. The sharp peaks and strict linear slopes of a triangular function ensure the system reacts sensitively and decisively to these crucial thresholds, as there is a definitive, undeniable peak to what constitutes "50% Health" or "Gun Level 2."</w:t>
       </w:r>
     </w:p>
     <w:p>
@@ -2285,58 +2109,10 @@
           <w:bCs/>
         </w:rPr>
         <w:lastRenderedPageBreak/>
-        <w:t>Trapezoidal Functions for Edge Cases (</w:t>
-      </w:r>
-      <w:proofErr w:type="spellStart"/>
-      <w:r>
-        <w:rPr>
-          <w:b/>
-          <w:bCs/>
-        </w:rPr>
-        <w:t>time_elapsed</w:t>
-      </w:r>
-      <w:proofErr w:type="spellEnd"/>
-      <w:r>
-        <w:rPr>
-          <w:b/>
-          <w:bCs/>
-        </w:rPr>
-        <w:t xml:space="preserve">, </w:t>
-      </w:r>
-      <w:proofErr w:type="spellStart"/>
-      <w:r>
-        <w:rPr>
-          <w:b/>
-          <w:bCs/>
-        </w:rPr>
-        <w:t>restart_count</w:t>
-      </w:r>
-      <w:proofErr w:type="spellEnd"/>
-      <w:r>
-        <w:rPr>
-          <w:b/>
-          <w:bCs/>
-        </w:rPr>
-        <w:t>):</w:t>
-      </w:r>
-      <w:r>
-        <w:t xml:space="preserve"> Trapezoidal functions (</w:t>
-      </w:r>
-      <w:proofErr w:type="spellStart"/>
-      <w:r>
-        <w:t>trapmf</w:t>
-      </w:r>
-      <w:proofErr w:type="spellEnd"/>
-      <w:r>
-        <w:t xml:space="preserve">) were deployed at the extreme ends of several universes of discourse. For instance, the "Very High" set for </w:t>
-      </w:r>
-      <w:proofErr w:type="spellStart"/>
-      <w:r>
-        <w:t>time_elapsed</w:t>
-      </w:r>
-      <w:proofErr w:type="spellEnd"/>
-      <w:r>
-        <w:t xml:space="preserve"> plateaus from 540 to 600 seconds. This ensures that once a player survives past an extreme threshold, the engine considers them permanently in that maximum state without their membership degree mathematically tapering off as the timer continues to climb.</w:t>
+        <w:t>Trapezoidal Functions for Edge Cases (time_elapsed, restart_count):</w:t>
+      </w:r>
+      <w:r>
+        <w:t xml:space="preserve"> Trapezoidal functions (trapmf) were deployed at the extreme ends of several universes of discourse. For instance, the "Very High" set for time_elapsed plateaus from 540 to 600 seconds. This ensures that once a player survives past an extreme threshold, the engine considers them permanently in that maximum state without their membership degree mathematically tapering off as the timer continues to climb.</w:t>
       </w:r>
     </w:p>
     <w:p>
@@ -2789,61 +2565,35 @@
               <w:jc w:val="both"/>
             </w:pPr>
             <w:r>
-              <w:t>Lives=Low AND Health=</w:t>
-            </w:r>
-            <w:proofErr w:type="spellStart"/>
-            <w:r>
-              <w:t>V.Low</w:t>
-            </w:r>
-            <w:proofErr w:type="spellEnd"/>
-          </w:p>
-        </w:tc>
-        <w:tc>
-          <w:tcPr>
-            <w:tcW w:w="0" w:type="auto"/>
-            <w:tcBorders>
-              <w:top w:val="single" w:sz="6" w:space="0" w:color="C4C7C5"/>
-              <w:left w:val="single" w:sz="6" w:space="0" w:color="C4C7C5"/>
-              <w:bottom w:val="single" w:sz="6" w:space="0" w:color="C4C7C5"/>
-              <w:right w:val="single" w:sz="6" w:space="0" w:color="C4C7C5"/>
-            </w:tcBorders>
-            <w:tcMar>
-              <w:top w:w="120" w:type="dxa"/>
-              <w:left w:w="180" w:type="dxa"/>
-              <w:bottom w:w="120" w:type="dxa"/>
-              <w:right w:w="180" w:type="dxa"/>
-            </w:tcMar>
-            <w:vAlign w:val="center"/>
-            <w:hideMark/>
-          </w:tcPr>
-          <w:p>
-            <w:pPr>
-              <w:jc w:val="both"/>
-            </w:pPr>
-            <w:r>
-              <w:t>Speed=</w:t>
-            </w:r>
-            <w:proofErr w:type="spellStart"/>
-            <w:r>
-              <w:t>V.Low</w:t>
-            </w:r>
-            <w:proofErr w:type="spellEnd"/>
-            <w:r>
-              <w:t>, Delay=</w:t>
-            </w:r>
-            <w:proofErr w:type="spellStart"/>
-            <w:r>
-              <w:t>V.High</w:t>
-            </w:r>
-            <w:proofErr w:type="spellEnd"/>
-            <w:r>
-              <w:t>, Size=</w:t>
-            </w:r>
-            <w:proofErr w:type="spellStart"/>
-            <w:r>
-              <w:t>V.Low</w:t>
-            </w:r>
-            <w:proofErr w:type="spellEnd"/>
+              <w:t>Lives=Low AND Health=V.Low</w:t>
+            </w:r>
+          </w:p>
+        </w:tc>
+        <w:tc>
+          <w:tcPr>
+            <w:tcW w:w="0" w:type="auto"/>
+            <w:tcBorders>
+              <w:top w:val="single" w:sz="6" w:space="0" w:color="C4C7C5"/>
+              <w:left w:val="single" w:sz="6" w:space="0" w:color="C4C7C5"/>
+              <w:bottom w:val="single" w:sz="6" w:space="0" w:color="C4C7C5"/>
+              <w:right w:val="single" w:sz="6" w:space="0" w:color="C4C7C5"/>
+            </w:tcBorders>
+            <w:tcMar>
+              <w:top w:w="120" w:type="dxa"/>
+              <w:left w:w="180" w:type="dxa"/>
+              <w:bottom w:w="120" w:type="dxa"/>
+              <w:right w:w="180" w:type="dxa"/>
+            </w:tcMar>
+            <w:vAlign w:val="center"/>
+            <w:hideMark/>
+          </w:tcPr>
+          <w:p>
+            <w:pPr>
+              <w:jc w:val="both"/>
+            </w:pPr>
+            <w:r>
+              <w:t>Speed=V.Low, Delay=V.High, Size=V.Low</w:t>
+            </w:r>
           </w:p>
         </w:tc>
       </w:tr>
@@ -2959,15 +2709,7 @@
               <w:jc w:val="both"/>
             </w:pPr>
             <w:r>
-              <w:t>Time=High/</w:t>
-            </w:r>
-            <w:proofErr w:type="spellStart"/>
-            <w:r>
-              <w:t>V.High</w:t>
-            </w:r>
-            <w:proofErr w:type="spellEnd"/>
-            <w:r>
-              <w:t xml:space="preserve"> AND Health=Low</w:t>
+              <w:t>Time=High/V.High AND Health=Low</w:t>
             </w:r>
           </w:p>
         </w:tc>
@@ -3255,21 +2997,8 @@
               <w:jc w:val="both"/>
             </w:pPr>
             <w:r>
-              <w:t>Time=</w:t>
-            </w:r>
-            <w:proofErr w:type="spellStart"/>
-            <w:r>
-              <w:t>V.Low</w:t>
-            </w:r>
-            <w:proofErr w:type="spellEnd"/>
-            <w:r>
-              <w:t xml:space="preserve"> AND Health=</w:t>
-            </w:r>
-            <w:proofErr w:type="spellStart"/>
-            <w:r>
-              <w:t>V.Low</w:t>
-            </w:r>
-            <w:proofErr w:type="spellEnd"/>
+              <w:t>Time=V.Low AND Health=V.Low</w:t>
+            </w:r>
           </w:p>
         </w:tc>
         <w:tc>
@@ -3412,13 +3141,8 @@
               <w:jc w:val="both"/>
             </w:pPr>
             <w:r>
-              <w:t>Health=</w:t>
-            </w:r>
-            <w:proofErr w:type="spellStart"/>
-            <w:r>
-              <w:t>V.Low</w:t>
-            </w:r>
-            <w:proofErr w:type="spellEnd"/>
+              <w:t>Health=V.Low</w:t>
+            </w:r>
           </w:p>
         </w:tc>
         <w:tc>
@@ -3561,50 +3285,34 @@
               <w:jc w:val="both"/>
             </w:pPr>
             <w:r>
-              <w:t>Gun=Low AND Kills=</w:t>
-            </w:r>
-            <w:proofErr w:type="spellStart"/>
-            <w:r>
-              <w:t>V.Low</w:t>
-            </w:r>
-            <w:proofErr w:type="spellEnd"/>
-            <w:r>
-              <w:t xml:space="preserve"> AND Time=Med/High</w:t>
-            </w:r>
-          </w:p>
-        </w:tc>
-        <w:tc>
-          <w:tcPr>
-            <w:tcW w:w="0" w:type="auto"/>
-            <w:tcBorders>
-              <w:top w:val="single" w:sz="6" w:space="0" w:color="C4C7C5"/>
-              <w:left w:val="single" w:sz="6" w:space="0" w:color="C4C7C5"/>
-              <w:bottom w:val="single" w:sz="6" w:space="0" w:color="C4C7C5"/>
-              <w:right w:val="single" w:sz="6" w:space="0" w:color="C4C7C5"/>
-            </w:tcBorders>
-            <w:tcMar>
-              <w:top w:w="120" w:type="dxa"/>
-              <w:left w:w="180" w:type="dxa"/>
-              <w:bottom w:w="120" w:type="dxa"/>
-              <w:right w:w="180" w:type="dxa"/>
-            </w:tcMar>
-            <w:vAlign w:val="center"/>
-            <w:hideMark/>
-          </w:tcPr>
-          <w:p>
-            <w:pPr>
-              <w:jc w:val="both"/>
-            </w:pPr>
-            <w:r>
-              <w:t>Speed=</w:t>
-            </w:r>
-            <w:proofErr w:type="spellStart"/>
-            <w:r>
-              <w:t>V.Low</w:t>
-            </w:r>
-            <w:proofErr w:type="spellEnd"/>
-            <w:r>
-              <w:t>, Delay=High, Size=Low</w:t>
+              <w:t>Gun=Low AND Kills=V.Low AND Time=Med/High</w:t>
+            </w:r>
+          </w:p>
+        </w:tc>
+        <w:tc>
+          <w:tcPr>
+            <w:tcW w:w="0" w:type="auto"/>
+            <w:tcBorders>
+              <w:top w:val="single" w:sz="6" w:space="0" w:color="C4C7C5"/>
+              <w:left w:val="single" w:sz="6" w:space="0" w:color="C4C7C5"/>
+              <w:bottom w:val="single" w:sz="6" w:space="0" w:color="C4C7C5"/>
+              <w:right w:val="single" w:sz="6" w:space="0" w:color="C4C7C5"/>
+            </w:tcBorders>
+            <w:tcMar>
+              <w:top w:w="120" w:type="dxa"/>
+              <w:left w:w="180" w:type="dxa"/>
+              <w:bottom w:w="120" w:type="dxa"/>
+              <w:right w:w="180" w:type="dxa"/>
+            </w:tcMar>
+            <w:vAlign w:val="center"/>
+            <w:hideMark/>
+          </w:tcPr>
+          <w:p>
+            <w:pPr>
+              <w:jc w:val="both"/>
+            </w:pPr>
+            <w:r>
+              <w:t>Speed=V.Low, Delay=High, Size=Low</w:t>
             </w:r>
           </w:p>
         </w:tc>
@@ -3721,21 +3429,8 @@
               <w:jc w:val="both"/>
             </w:pPr>
             <w:r>
-              <w:t>Time=</w:t>
-            </w:r>
-            <w:proofErr w:type="spellStart"/>
-            <w:r>
-              <w:t>V.Low</w:t>
-            </w:r>
-            <w:proofErr w:type="spellEnd"/>
-            <w:r>
-              <w:t xml:space="preserve"> AND Kills=</w:t>
-            </w:r>
-            <w:proofErr w:type="spellStart"/>
-            <w:r>
-              <w:t>V.Low</w:t>
-            </w:r>
-            <w:proofErr w:type="spellEnd"/>
+              <w:t>Time=V.Low AND Kills=V.Low</w:t>
+            </w:r>
           </w:p>
         </w:tc>
         <w:tc>
@@ -4743,72 +4438,35 @@
               <w:jc w:val="both"/>
             </w:pPr>
             <w:r>
-              <w:t>Kills=</w:t>
-            </w:r>
-            <w:proofErr w:type="spellStart"/>
-            <w:r>
-              <w:t>V.High</w:t>
-            </w:r>
-            <w:proofErr w:type="spellEnd"/>
-            <w:r>
-              <w:t xml:space="preserve"> AND Health=</w:t>
-            </w:r>
-            <w:proofErr w:type="spellStart"/>
-            <w:r>
-              <w:t>V.High</w:t>
-            </w:r>
-            <w:proofErr w:type="spellEnd"/>
-            <w:r>
-              <w:t xml:space="preserve"> AND Lives=High</w:t>
-            </w:r>
-          </w:p>
-        </w:tc>
-        <w:tc>
-          <w:tcPr>
-            <w:tcW w:w="0" w:type="auto"/>
-            <w:tcBorders>
-              <w:top w:val="single" w:sz="6" w:space="0" w:color="C4C7C5"/>
-              <w:left w:val="single" w:sz="6" w:space="0" w:color="C4C7C5"/>
-              <w:bottom w:val="single" w:sz="6" w:space="0" w:color="C4C7C5"/>
-              <w:right w:val="single" w:sz="6" w:space="0" w:color="C4C7C5"/>
-            </w:tcBorders>
-            <w:tcMar>
-              <w:top w:w="120" w:type="dxa"/>
-              <w:left w:w="180" w:type="dxa"/>
-              <w:bottom w:w="120" w:type="dxa"/>
-              <w:right w:w="180" w:type="dxa"/>
-            </w:tcMar>
-            <w:vAlign w:val="center"/>
-            <w:hideMark/>
-          </w:tcPr>
-          <w:p>
-            <w:pPr>
-              <w:jc w:val="both"/>
-            </w:pPr>
-            <w:r>
-              <w:t>Speed=</w:t>
-            </w:r>
-            <w:proofErr w:type="spellStart"/>
-            <w:r>
-              <w:t>V.High</w:t>
-            </w:r>
-            <w:proofErr w:type="spellEnd"/>
-            <w:r>
-              <w:t>, Delay=</w:t>
-            </w:r>
-            <w:proofErr w:type="spellStart"/>
-            <w:r>
-              <w:t>V.Low</w:t>
-            </w:r>
-            <w:proofErr w:type="spellEnd"/>
-            <w:r>
-              <w:t>, Size=</w:t>
-            </w:r>
-            <w:proofErr w:type="spellStart"/>
-            <w:r>
-              <w:t>V.High</w:t>
-            </w:r>
-            <w:proofErr w:type="spellEnd"/>
+              <w:t>Kills=V.High AND Health=V.High AND Lives=High</w:t>
+            </w:r>
+          </w:p>
+        </w:tc>
+        <w:tc>
+          <w:tcPr>
+            <w:tcW w:w="0" w:type="auto"/>
+            <w:tcBorders>
+              <w:top w:val="single" w:sz="6" w:space="0" w:color="C4C7C5"/>
+              <w:left w:val="single" w:sz="6" w:space="0" w:color="C4C7C5"/>
+              <w:bottom w:val="single" w:sz="6" w:space="0" w:color="C4C7C5"/>
+              <w:right w:val="single" w:sz="6" w:space="0" w:color="C4C7C5"/>
+            </w:tcBorders>
+            <w:tcMar>
+              <w:top w:w="120" w:type="dxa"/>
+              <w:left w:w="180" w:type="dxa"/>
+              <w:bottom w:w="120" w:type="dxa"/>
+              <w:right w:w="180" w:type="dxa"/>
+            </w:tcMar>
+            <w:vAlign w:val="center"/>
+            <w:hideMark/>
+          </w:tcPr>
+          <w:p>
+            <w:pPr>
+              <w:jc w:val="both"/>
+            </w:pPr>
+            <w:r>
+              <w:t>Speed=V.High, Delay=V.Low, Size=V.High</w:t>
+            </w:r>
           </w:p>
         </w:tc>
       </w:tr>
@@ -5069,15 +4727,7 @@
               <w:jc w:val="both"/>
             </w:pPr>
             <w:r>
-              <w:t>Time=</w:t>
-            </w:r>
-            <w:proofErr w:type="spellStart"/>
-            <w:r>
-              <w:t>V.High</w:t>
-            </w:r>
-            <w:proofErr w:type="spellEnd"/>
-            <w:r>
-              <w:t xml:space="preserve"> AND Health=High</w:t>
+              <w:t>Time=V.High AND Health=High</w:t>
             </w:r>
           </w:p>
         </w:tc>
@@ -5536,15 +5186,7 @@
               <w:jc w:val="both"/>
             </w:pPr>
             <w:r>
-              <w:t>Speed=</w:t>
-            </w:r>
-            <w:proofErr w:type="spellStart"/>
-            <w:r>
-              <w:t>V.High</w:t>
-            </w:r>
-            <w:proofErr w:type="spellEnd"/>
-            <w:r>
-              <w:t>, Delay=Low, Size=Low</w:t>
+              <w:t>Speed=V.High, Delay=Low, Size=Low</w:t>
             </w:r>
           </w:p>
         </w:tc>
@@ -5805,56 +5447,35 @@
               <w:jc w:val="both"/>
             </w:pPr>
             <w:r>
-              <w:t>Time=Med/High AND Health=</w:t>
-            </w:r>
-            <w:proofErr w:type="spellStart"/>
-            <w:r>
-              <w:t>V.High</w:t>
-            </w:r>
-            <w:proofErr w:type="spellEnd"/>
-            <w:r>
-              <w:t xml:space="preserve"> AND Kills=Low</w:t>
-            </w:r>
-          </w:p>
-        </w:tc>
-        <w:tc>
-          <w:tcPr>
-            <w:tcW w:w="0" w:type="auto"/>
-            <w:tcBorders>
-              <w:top w:val="single" w:sz="6" w:space="0" w:color="C4C7C5"/>
-              <w:left w:val="single" w:sz="6" w:space="0" w:color="C4C7C5"/>
-              <w:bottom w:val="single" w:sz="6" w:space="0" w:color="C4C7C5"/>
-              <w:right w:val="single" w:sz="6" w:space="0" w:color="C4C7C5"/>
-            </w:tcBorders>
-            <w:tcMar>
-              <w:top w:w="120" w:type="dxa"/>
-              <w:left w:w="180" w:type="dxa"/>
-              <w:bottom w:w="120" w:type="dxa"/>
-              <w:right w:w="180" w:type="dxa"/>
-            </w:tcMar>
-            <w:vAlign w:val="center"/>
-            <w:hideMark/>
-          </w:tcPr>
-          <w:p>
-            <w:pPr>
-              <w:jc w:val="both"/>
-            </w:pPr>
-            <w:r>
-              <w:t>Speed=Low, Delay=</w:t>
-            </w:r>
-            <w:proofErr w:type="spellStart"/>
-            <w:r>
-              <w:t>V.Low</w:t>
-            </w:r>
-            <w:proofErr w:type="spellEnd"/>
-            <w:r>
-              <w:t>, Size=</w:t>
-            </w:r>
-            <w:proofErr w:type="spellStart"/>
-            <w:r>
-              <w:t>V.High</w:t>
-            </w:r>
-            <w:proofErr w:type="spellEnd"/>
+              <w:t>Time=Med/High AND Health=V.High AND Kills=Low</w:t>
+            </w:r>
+          </w:p>
+        </w:tc>
+        <w:tc>
+          <w:tcPr>
+            <w:tcW w:w="0" w:type="auto"/>
+            <w:tcBorders>
+              <w:top w:val="single" w:sz="6" w:space="0" w:color="C4C7C5"/>
+              <w:left w:val="single" w:sz="6" w:space="0" w:color="C4C7C5"/>
+              <w:bottom w:val="single" w:sz="6" w:space="0" w:color="C4C7C5"/>
+              <w:right w:val="single" w:sz="6" w:space="0" w:color="C4C7C5"/>
+            </w:tcBorders>
+            <w:tcMar>
+              <w:top w:w="120" w:type="dxa"/>
+              <w:left w:w="180" w:type="dxa"/>
+              <w:bottom w:w="120" w:type="dxa"/>
+              <w:right w:w="180" w:type="dxa"/>
+            </w:tcMar>
+            <w:vAlign w:val="center"/>
+            <w:hideMark/>
+          </w:tcPr>
+          <w:p>
+            <w:pPr>
+              <w:jc w:val="both"/>
+            </w:pPr>
+            <w:r>
+              <w:t>Speed=Low, Delay=V.Low, Size=V.High</w:t>
+            </w:r>
           </w:p>
         </w:tc>
       </w:tr>
@@ -5997,29 +5618,8 @@
               <w:jc w:val="both"/>
             </w:pPr>
             <w:r>
-              <w:t>Speed=</w:t>
-            </w:r>
-            <w:proofErr w:type="spellStart"/>
-            <w:r>
-              <w:t>V.High</w:t>
-            </w:r>
-            <w:proofErr w:type="spellEnd"/>
-            <w:r>
-              <w:t>, Delay=</w:t>
-            </w:r>
-            <w:proofErr w:type="spellStart"/>
-            <w:r>
-              <w:t>V.Low</w:t>
-            </w:r>
-            <w:proofErr w:type="spellEnd"/>
-            <w:r>
-              <w:t>, Size=</w:t>
-            </w:r>
-            <w:proofErr w:type="spellStart"/>
-            <w:r>
-              <w:t>V.High</w:t>
-            </w:r>
-            <w:proofErr w:type="spellEnd"/>
+              <w:t>Speed=V.High, Delay=V.Low, Size=V.High</w:t>
+            </w:r>
           </w:p>
         </w:tc>
       </w:tr>
@@ -6307,23 +5907,7 @@
               <w:jc w:val="both"/>
             </w:pPr>
             <w:r>
-              <w:t>Speed=</w:t>
-            </w:r>
-            <w:proofErr w:type="spellStart"/>
-            <w:r>
-              <w:t>V.High</w:t>
-            </w:r>
-            <w:proofErr w:type="spellEnd"/>
-            <w:r>
-              <w:t>, Delay=</w:t>
-            </w:r>
-            <w:proofErr w:type="spellStart"/>
-            <w:r>
-              <w:t>V.Low</w:t>
-            </w:r>
-            <w:proofErr w:type="spellEnd"/>
-            <w:r>
-              <w:t>, Size=High</w:t>
+              <w:t>Speed=V.High, Delay=V.Low, Size=High</w:t>
             </w:r>
           </w:p>
         </w:tc>
@@ -6380,31 +5964,7 @@
         <w:jc w:val="both"/>
       </w:pPr>
       <w:r>
-        <w:t xml:space="preserve">Validating a dynamic, real-time system poses a unique challenge, as live gameplay generates unpredictable, highly volatile data. To rigorously evaluate the accuracy and performance of the Fuzzy Expert System, a deterministic "headless" testing script was developed. This script bypasses the </w:t>
-      </w:r>
-      <w:proofErr w:type="spellStart"/>
-      <w:r>
-        <w:t>Pygame</w:t>
-      </w:r>
-      <w:proofErr w:type="spellEnd"/>
-      <w:r>
-        <w:t xml:space="preserve"> loop and directly injects 15 fixed, highly specific edge-case scenarios into the </w:t>
-      </w:r>
-      <w:proofErr w:type="spellStart"/>
-      <w:r>
-        <w:t>FuzzyDifficultyEngine.evaluate</w:t>
-      </w:r>
-      <w:proofErr w:type="spellEnd"/>
-      <w:r>
-        <w:t xml:space="preserve">() function. This allows us to compare the mathematically </w:t>
-      </w:r>
-      <w:proofErr w:type="spellStart"/>
-      <w:r>
-        <w:t>defuzzified</w:t>
-      </w:r>
-      <w:proofErr w:type="spellEnd"/>
-      <w:r>
-        <w:t xml:space="preserve"> outputs against the expected design behaviors without the interference of live player mechanics.</w:t>
+        <w:t>Validating a dynamic, real-time system poses a unique challenge, as live gameplay generates unpredictable, highly volatile data. To rigorously evaluate the accuracy and performance of the Fuzzy Expert System, a deterministic "headless" testing script was developed. This script bypasses the Pygame loop and directly injects 15 fixed, highly specific edge-case scenarios into the FuzzyDifficultyEngine.evaluate() function. This allows us to compare the mathematically defuzzified outputs against the expected design behaviors without the interference of live player mechanics.</w:t>
       </w:r>
     </w:p>
     <w:p>
@@ -6428,15 +5988,7 @@
         <w:jc w:val="both"/>
       </w:pPr>
       <w:r>
-        <w:t xml:space="preserve">To ensure all four rule categories (Mercy, Neutral, Challenge, Special) were thoroughly tested, a dataset of 15 distinct player states was formulated and fed into the system. The complete parameters and the resulting </w:t>
-      </w:r>
-      <w:proofErr w:type="spellStart"/>
-      <w:r>
-        <w:t>defuzzified</w:t>
-      </w:r>
-      <w:proofErr w:type="spellEnd"/>
-      <w:r>
-        <w:t xml:space="preserve"> outputs are compiled in the accompanying fuzzy_validation_results.csv file submitted alongside this report.</w:t>
+        <w:t>To ensure all four rule categories (Mercy, Neutral, Challenge, Special) were thoroughly tested, a dataset of 15 distinct player states was formulated and fed into the system. The complete parameters and the resulting defuzzified outputs are compiled in the accompanying fuzzy_validation_results.csv file.</w:t>
       </w:r>
     </w:p>
     <w:p>
@@ -6468,7 +6020,13 @@
         <w:jc w:val="both"/>
       </w:pPr>
       <w:r>
-        <w:t>The results documented in the CSV file successfully validate the core mechanics of the engine. Extreme ends of the spectrum performed exactly as engineered: struggling players in Test 1 ("Critical Mercy") were granted distinct mathematical assistance (Spawn Delay raised to nearly 2.5 seconds), while dominating players in Test 13 ("MAX OVERDRIVE") faced brutal conditions (Spawn Delay dropped to 0.59s with highly accelerated enemy speeds).</w:t>
+        <w:t xml:space="preserve">The results validate the core mechanics of the engine. </w:t>
+      </w:r>
+      <w:r>
+        <w:t>The engine</w:t>
+      </w:r>
+      <w:r>
+        <w:t xml:space="preserve"> performed exactly as engineered: struggling players in Test 1 ("Critical Mercy") were granted distinct mathematical assistance (Spawn Delay raised to nearly 2.5 seconds), while dominating players in Test 13 ("MAX OVERDRIVE") faced brutal conditions (Spawn Delay dropped to 0.59s with highly accelerated enemy speeds).</w:t>
       </w:r>
     </w:p>
     <w:p>
@@ -6476,8 +6034,11 @@
         <w:jc w:val="both"/>
       </w:pPr>
       <w:r>
+        <w:t xml:space="preserve">Furthermore, the dataset reveals the highly sophisticated emergent behavior created by centroid defuzzification. In Test 15 ("The Last Stand"), the player has massive kills, high </w:t>
+      </w:r>
+      <w:r>
         <w:lastRenderedPageBreak/>
-        <w:t>Furthermore, the dataset reveals the highly sophisticated emergent behavior created by centroid defuzzification. In Test 15 ("The Last Stand"), the player has massive kills, high time, and maximum firepower, which normally triggers extreme difficulty. However, because they are on their final life with critical health, Rule 1 (Critical Mercy) overpowered the challenge rules. The system successfully calculated that the player's immediate risk of dying outweighed their historical success, pulling the mathematical average down to prioritize player survival (slowing speed to 0.90x). This proves the multi-variable blending is working seamlessly.</w:t>
+        <w:t>time, and maximum firepower, which normally triggers extreme difficulty. However, because they are on their final life with critical health, Rule 1 (Critical Mercy) overpowered the challenge rules. The system successfully calculated that the player's immediate risk of dying outweighed their historical success, pulling the mathematical average down to prioritize player survival (slowing speed to 0.90x). This proves the multi-variable blending is working seamlessly.</w:t>
       </w:r>
     </w:p>
     <w:p>
@@ -6537,13 +6098,8 @@
         </w:numPr>
         <w:jc w:val="both"/>
       </w:pPr>
-      <w:proofErr w:type="spellStart"/>
-      <w:r>
-        <w:t>pygame</w:t>
-      </w:r>
-      <w:proofErr w:type="spellEnd"/>
-      <w:r>
-        <w:t xml:space="preserve"> (v2.0+): Powers the 2D rendering engine, audio, and the interactive debug UI.</w:t>
+      <w:r>
+        <w:t>pygame (v2.0+): Powers the 2D rendering engine, audio, and the interactive debug UI.</w:t>
       </w:r>
     </w:p>
     <w:p>
@@ -6554,13 +6110,8 @@
         </w:numPr>
         <w:jc w:val="both"/>
       </w:pPr>
-      <w:proofErr w:type="spellStart"/>
-      <w:r>
-        <w:t>numpy</w:t>
-      </w:r>
-      <w:proofErr w:type="spellEnd"/>
-      <w:r>
-        <w:t>: Handles the underlying mathematical arrays and continuous universe generation.</w:t>
+      <w:r>
+        <w:t>numpy: Handles the underlying mathematical arrays and continuous universe generation.</w:t>
       </w:r>
     </w:p>
     <w:p>
@@ -6572,15 +6123,7 @@
         <w:jc w:val="both"/>
       </w:pPr>
       <w:r>
-        <w:t>scikit-fuzzy (</w:t>
-      </w:r>
-      <w:proofErr w:type="spellStart"/>
-      <w:r>
-        <w:t>skfuzzy</w:t>
-      </w:r>
-      <w:proofErr w:type="spellEnd"/>
-      <w:r>
-        <w:t>): The core library driving the Mamdani inference engine, membership function generation, and defuzzification.</w:t>
+        <w:t>scikit-fuzzy (skfuzzy): The core library driving the Mamdani inference engine, membership function generation, and defuzzification.</w:t>
       </w:r>
     </w:p>
     <w:p>
@@ -6598,45 +6141,17 @@
         <w:t xml:space="preserve"> The foundational gameplay loop, sprite rendering, and basic collision physics were adapted from the open-source repository </w:t>
       </w:r>
       <w:hyperlink r:id="rId12" w:tgtFrame="_blank" w:history="1">
-        <w:proofErr w:type="spellStart"/>
         <w:r>
           <w:rPr>
             <w:rStyle w:val="Hyperlink"/>
             <w:b/>
             <w:bCs/>
           </w:rPr>
-          <w:t>SpaceShooter</w:t>
+          <w:t>SpaceShooter by tasdikrahman</w:t>
         </w:r>
-        <w:proofErr w:type="spellEnd"/>
-        <w:r>
-          <w:rPr>
-            <w:rStyle w:val="Hyperlink"/>
-            <w:b/>
-            <w:bCs/>
-          </w:rPr>
-          <w:t xml:space="preserve"> by </w:t>
-        </w:r>
-        <w:proofErr w:type="spellStart"/>
-        <w:r>
-          <w:rPr>
-            <w:rStyle w:val="Hyperlink"/>
-            <w:b/>
-            <w:bCs/>
-          </w:rPr>
-          <w:t>tasdikrahman</w:t>
-        </w:r>
-        <w:proofErr w:type="spellEnd"/>
       </w:hyperlink>
       <w:r>
-        <w:t xml:space="preserve">. The specific engineering contributions of this project include the integration of the </w:t>
-      </w:r>
-      <w:proofErr w:type="spellStart"/>
-      <w:r>
-        <w:t>FuzzyDifficultyEngine</w:t>
-      </w:r>
-      <w:proofErr w:type="spellEnd"/>
-      <w:r>
-        <w:t>, the custom DDA UI overlays (Plots Panel and Rule Dictionary), and the dynamic scaling of entity speeds, spawn delays, and hitboxes based on centroid defuzzification.</w:t>
+        <w:t>. The specific engineering contributions of this project include the integration of the FuzzyDifficultyEngine, the custom DDA UI overlays (Plots Panel and Rule Dictionary), and the dynamic scaling of entity speeds, spawn delays, and hitboxes based on centroid defuzzification.</w:t>
       </w:r>
     </w:p>
     <w:p>
@@ -6741,19 +6256,14 @@
           <w:b/>
           <w:bCs/>
         </w:rPr>
+        <w:t>[M] Toggle Manual Mode:</w:t>
+      </w:r>
+      <w:r>
+        <w:t xml:space="preserve"> Pauses the active game state and unlocks the "Crisp Inputs" text boxes in the Top Bar. Users can click on any input (e.g., Kills, Health) </w:t>
+      </w:r>
+      <w:r>
         <w:lastRenderedPageBreak/>
-        <w:t>[M] Toggle Manual Mode:</w:t>
-      </w:r>
-      <w:r>
-        <w:t xml:space="preserve"> Pauses the active game state and unlocks the "Crisp Inputs" text boxes in the Top Bar. Users can click on any input (e.g., Kills, Health) and manually type in a new integer to instantly override the game state. The </w:t>
-      </w:r>
-      <w:proofErr w:type="spellStart"/>
-      <w:r>
-        <w:t>defuzzified</w:t>
-      </w:r>
-      <w:proofErr w:type="spellEnd"/>
-      <w:r>
-        <w:t xml:space="preserve"> outputs will instantly recalculate.</w:t>
+        <w:t>and manually type in a new integer to instantly override the game state. The defuzzified outputs will instantly recalculate.</w:t>
       </w:r>
     </w:p>
     <w:p>
@@ -6820,15 +6330,7 @@
         <w:t>[TAB]:</w:t>
       </w:r>
       <w:r>
-        <w:t xml:space="preserve"> Pauses/</w:t>
-      </w:r>
-      <w:proofErr w:type="spellStart"/>
-      <w:r>
-        <w:t>Unpauses</w:t>
-      </w:r>
-      <w:proofErr w:type="spellEnd"/>
-      <w:r>
-        <w:t xml:space="preserve"> the game normally.</w:t>
+        <w:t xml:space="preserve"> Pauses/Unpauses the game normally.</w:t>
       </w:r>
     </w:p>
     <w:p>
@@ -6866,7 +6368,13 @@
         <w:jc w:val="both"/>
       </w:pPr>
       <w:r>
-        <w:t>This project successfully demonstrates the immense superiority of Fuzzy Logic over traditional, hard-coded threshold systems in video game design. By mapping the subjective, uncertain nature of human skill to precise mathematical continuous curves, the space shooter achieves a state of constant equilibrium. The difficulty scales invisibly, catching struggling players before they fail and challenging expert players just as they begin to master the loop.</w:t>
+        <w:t xml:space="preserve">This project successfully demonstrates the immense superiority of Fuzzy Logic over traditional, hard-coded threshold systems in video game design. By mapping the subjective, uncertain nature of human skill to precise mathematical continuous curves, the space shooter achieves a state of constant </w:t>
+      </w:r>
+      <w:r>
+        <w:t>balance</w:t>
+      </w:r>
+      <w:r>
+        <w:t>. The difficulty scales invisibly, catching struggling players before they fail and challenging expert players just as they begin to master the loop.</w:t>
       </w:r>
     </w:p>
     <w:p>
@@ -6915,7 +6423,7 @@
         <v:path o:extrusionok="f" gradientshapeok="t" o:connecttype="rect"/>
         <o:lock v:ext="edit" aspectratio="t"/>
       </v:shapetype>
-      <v:shape id="Picture 7" o:spid="_x0000_i1025" type="#_x0000_t75" style="width:9.75pt;height:40.5pt;visibility:visible;mso-wrap-style:square" o:bullet="t">
+      <v:shape id="Picture 7" o:spid="_x0000_i1025" type="#_x0000_t75" style="width:9.6pt;height:40.8pt;visibility:visible;mso-wrap-style:square" o:bullet="t">
         <v:imagedata r:id="rId1" o:title=""/>
       </v:shape>
     </w:pict>
@@ -8480,7 +7988,6 @@
   <w:style w:type="character" w:default="1" w:styleId="DefaultParagraphFont">
     <w:name w:val="Default Paragraph Font"/>
     <w:uiPriority w:val="1"/>
-    <w:semiHidden/>
     <w:unhideWhenUsed/>
   </w:style>
   <w:style w:type="table" w:default="1" w:styleId="TableNormal">

</xml_diff>